<commit_message>
Update translation and reconstruction work
</commit_message>
<xml_diff>
--- a/backend/outputs/Synopsis (E) dated 01.03.2016_reconstructed_hi.docx
+++ b/backend/outputs/Synopsis (E) dated 01.03.2016_reconstructed_hi.docx
@@ -17,9 +17,11 @@
         <w:rPr>
           <w:rFonts w:cs="Nirmala UI" w:eastAsia="Nirmala UI"/>
           <w:b/>
-          <w:sz w:val="22"/>
-          <w:bCs w:val="1"/>
-          <w:szCs w:val="22"/>
+          <w:bCs/>
+          <w:i w:val="0"/>
+          <w:sz w:val="22"/>
+          <w:szCs w:val="22"/>
+          <w:u w:val="none"/>
         </w:rPr>
         <w:t>रजिया साभा</w:t>
       </w:r>
@@ -38,9 +40,11 @@
       <w:r>
         <w:rPr>
           <w:b/>
-          <w:sz w:val="22"/>
-          <w:bCs w:val="1"/>
-          <w:szCs w:val="22"/>
+          <w:bCs/>
+          <w:i w:val="0"/>
+          <w:sz w:val="22"/>
+          <w:szCs w:val="22"/>
+          <w:u w:val="none"/>
         </w:rPr>
         <w:t>_______</w:t>
       </w:r>
@@ -60,11 +64,14 @@
         <w:rPr>
           <w:rFonts w:cs="Nirmala UI" w:eastAsia="Nirmala UI"/>
           <w:b/>
-          <w:sz w:val="22"/>
-          <w:bCs w:val="1"/>
-          <w:szCs w:val="22"/>
+          <w:bCs/>
+          <w:i w:val="0"/>
+          <w:sz w:val="22"/>
+          <w:szCs w:val="22"/>
+          <w:u w:val="none"/>
         </w:rPr>
         <w:t>समर्पण की विशेषताएँ.</w:t>
+        <w:footnoteReference w:customMarkFollows="1" w:id="1"/>
       </w:r>
     </w:p>
     <w:p>
@@ -81,9 +88,11 @@
       <w:r>
         <w:rPr>
           <w:b/>
-          <w:sz w:val="22"/>
-          <w:bCs w:val="1"/>
-          <w:szCs w:val="22"/>
+          <w:bCs/>
+          <w:i w:val="0"/>
+          <w:sz w:val="22"/>
+          <w:szCs w:val="22"/>
+          <w:u w:val="none"/>
         </w:rPr>
         <w:t>_______</w:t>
       </w:r>
@@ -103,9 +112,11 @@
         <w:rPr>
           <w:rFonts w:cs="Nirmala UI" w:eastAsia="Nirmala UI"/>
           <w:b/>
-          <w:sz w:val="22"/>
-          <w:bCs w:val="1"/>
-          <w:szCs w:val="22"/>
+          <w:bCs/>
+          <w:i w:val="0"/>
+          <w:sz w:val="22"/>
+          <w:szCs w:val="22"/>
+          <w:u w:val="none"/>
         </w:rPr>
         <w:t>(प्रश्नों और उत्तरों के अलावा अन्य प्रक्रियाएं)</w:t>
       </w:r>
@@ -124,9 +135,11 @@
       <w:r>
         <w:rPr>
           <w:b/>
-          <w:sz w:val="22"/>
-          <w:bCs w:val="1"/>
-          <w:szCs w:val="22"/>
+          <w:bCs/>
+          <w:i w:val="0"/>
+          <w:sz w:val="22"/>
+          <w:szCs w:val="22"/>
+          <w:u w:val="none"/>
         </w:rPr>
         <w:t>_______</w:t>
       </w:r>
@@ -142,13 +155,19 @@
           <w:szCs w:val="22"/>
         </w:rPr>
       </w:pPr>
-      <w:r>
-        <w:rPr>
-          <w:rFonts w:cs="Nirmala UI" w:eastAsia="Nirmala UI"/>
-          <w:b/>
-          <w:sz w:val="22"/>
-          <w:bCs w:val="1"/>
-          <w:szCs w:val="22"/>
+      <w:proofErr w:type="spellStart"/>
+      <w:proofErr w:type="spellEnd"/>
+      <w:proofErr w:type="spellStart"/>
+      <w:proofErr w:type="spellEnd"/>
+      <w:r>
+        <w:rPr>
+          <w:rFonts w:cs="Nirmala UI" w:eastAsia="Nirmala UI"/>
+          <w:b/>
+          <w:bCs/>
+          <w:i w:val="0"/>
+          <w:sz w:val="22"/>
+          <w:szCs w:val="22"/>
+          <w:u w:val="none"/>
         </w:rPr>
         <w:t>ट्यूज</w:t>
       </w:r>
@@ -156,9 +175,11 @@
         <w:rPr>
           <w:rFonts w:cs="Nirmala UI" w:eastAsia="Nirmala UI"/>
           <w:b/>
-          <w:sz w:val="22"/>
-          <w:bCs w:val="1"/>
-          <w:szCs w:val="22"/>
+          <w:bCs/>
+          <w:i w:val="0"/>
+          <w:sz w:val="22"/>
+          <w:szCs w:val="22"/>
+          <w:u w:val="none"/>
         </w:rPr>
         <w:t xml:space="preserve">दिन में, </w:t>
       </w:r>
@@ -166,54 +187,66 @@
         <w:rPr>
           <w:rFonts w:cs="Nirmala UI" w:eastAsia="Nirmala UI"/>
           <w:b/>
-          <w:sz w:val="22"/>
-          <w:bCs w:val="1"/>
-          <w:szCs w:val="22"/>
+          <w:bCs/>
+          <w:i w:val="0"/>
+          <w:sz w:val="22"/>
+          <w:szCs w:val="22"/>
+          <w:u w:val="none"/>
         </w:rPr>
         <w:t>मार्च में</w:t>
       </w:r>
       <w:r>
         <w:rPr>
           <w:b/>
-          <w:sz w:val="22"/>
-          <w:bCs w:val="1"/>
-          <w:szCs w:val="22"/>
+          <w:bCs/>
+          <w:i w:val="0"/>
+          <w:sz w:val="22"/>
+          <w:szCs w:val="22"/>
+          <w:u w:val="none"/>
         </w:rPr>
         <w:t xml:space="preserve"> </w:t>
       </w:r>
       <w:r>
         <w:rPr>
           <w:b/>
-          <w:sz w:val="22"/>
-          <w:bCs w:val="1"/>
-          <w:szCs w:val="22"/>
+          <w:bCs/>
+          <w:i w:val="0"/>
+          <w:sz w:val="22"/>
+          <w:szCs w:val="22"/>
+          <w:u w:val="none"/>
         </w:rPr>
         <w:t>1</w:t>
       </w:r>
       <w:r>
         <w:rPr>
           <w:b/>
-          <w:sz w:val="22"/>
-          <w:bCs w:val="1"/>
-          <w:szCs w:val="22"/>
+          <w:bCs/>
+          <w:i w:val="0"/>
+          <w:sz w:val="22"/>
+          <w:szCs w:val="22"/>
+          <w:u w:val="none"/>
         </w:rPr>
         <w:t>, 201</w:t>
       </w:r>
       <w:r>
         <w:rPr>
           <w:b/>
-          <w:sz w:val="22"/>
-          <w:bCs w:val="1"/>
-          <w:szCs w:val="22"/>
+          <w:bCs/>
+          <w:i w:val="0"/>
+          <w:sz w:val="22"/>
+          <w:szCs w:val="22"/>
+          <w:u w:val="none"/>
         </w:rPr>
         <w:t>6</w:t>
       </w:r>
       <w:r>
         <w:rPr>
           <w:b/>
-          <w:sz w:val="22"/>
-          <w:bCs w:val="1"/>
-          <w:szCs w:val="22"/>
+          <w:bCs/>
+          <w:i w:val="0"/>
+          <w:sz w:val="22"/>
+          <w:szCs w:val="22"/>
+          <w:u w:val="none"/>
         </w:rPr>
         <w:t xml:space="preserve">/ </w:t>
       </w:r>
@@ -221,63 +254,77 @@
         <w:rPr>
           <w:rFonts w:cs="Nirmala UI" w:eastAsia="Nirmala UI"/>
           <w:b/>
-          <w:sz w:val="22"/>
-          <w:bCs w:val="1"/>
-          <w:szCs w:val="22"/>
+          <w:bCs/>
+          <w:i w:val="0"/>
+          <w:sz w:val="22"/>
+          <w:szCs w:val="22"/>
+          <w:u w:val="none"/>
         </w:rPr>
         <w:t>फाल्गुन.</w:t>
       </w:r>
       <w:r>
         <w:rPr>
           <w:b/>
-          <w:sz w:val="22"/>
-          <w:bCs w:val="1"/>
-          <w:szCs w:val="22"/>
+          <w:bCs/>
+          <w:i w:val="0"/>
+          <w:sz w:val="22"/>
+          <w:szCs w:val="22"/>
+          <w:u w:val="none"/>
         </w:rPr>
         <w:t xml:space="preserve"> </w:t>
       </w:r>
       <w:r>
         <w:rPr>
           <w:b/>
-          <w:sz w:val="22"/>
-          <w:bCs w:val="1"/>
-          <w:szCs w:val="22"/>
+          <w:bCs/>
+          <w:i w:val="0"/>
+          <w:sz w:val="22"/>
+          <w:szCs w:val="22"/>
+          <w:u w:val="none"/>
         </w:rPr>
         <w:t>1</w:t>
       </w:r>
       <w:r>
         <w:rPr>
           <w:b/>
-          <w:sz w:val="22"/>
-          <w:bCs w:val="1"/>
-          <w:szCs w:val="22"/>
+          <w:bCs/>
+          <w:i w:val="0"/>
+          <w:sz w:val="22"/>
+          <w:szCs w:val="22"/>
+          <w:u w:val="none"/>
         </w:rPr>
         <w:t>1</w:t>
       </w:r>
       <w:r>
         <w:rPr>
           <w:b/>
-          <w:sz w:val="22"/>
-          <w:bCs w:val="1"/>
-          <w:szCs w:val="22"/>
+          <w:bCs/>
+          <w:i w:val="0"/>
+          <w:sz w:val="22"/>
+          <w:szCs w:val="22"/>
+          <w:u w:val="none"/>
         </w:rPr>
         <w:t>, 193</w:t>
       </w:r>
       <w:r>
         <w:rPr>
           <w:b/>
-          <w:sz w:val="22"/>
-          <w:bCs w:val="1"/>
-          <w:szCs w:val="22"/>
+          <w:bCs/>
+          <w:i w:val="0"/>
+          <w:sz w:val="22"/>
+          <w:szCs w:val="22"/>
+          <w:u w:val="none"/>
         </w:rPr>
         <w:t>7</w:t>
       </w:r>
       <w:r>
         <w:rPr>
           <w:b/>
-          <w:sz w:val="22"/>
-          <w:bCs w:val="1"/>
-          <w:szCs w:val="22"/>
+          <w:bCs/>
+          <w:i w:val="0"/>
+          <w:sz w:val="22"/>
+          <w:szCs w:val="22"/>
+          <w:u w:val="none"/>
         </w:rPr>
         <w:t xml:space="preserve"> (</w:t>
       </w:r>
@@ -285,18 +332,22 @@
         <w:rPr>
           <w:rFonts w:cs="Nirmala UI" w:eastAsia="Nirmala UI"/>
           <w:b/>
-          <w:sz w:val="22"/>
-          <w:bCs w:val="1"/>
-          <w:szCs w:val="22"/>
+          <w:bCs/>
+          <w:i w:val="0"/>
+          <w:sz w:val="22"/>
+          <w:szCs w:val="22"/>
+          <w:u w:val="none"/>
         </w:rPr>
         <w:t>सका.</w:t>
       </w:r>
       <w:r>
         <w:rPr>
           <w:b/>
-          <w:sz w:val="22"/>
-          <w:bCs w:val="1"/>
-          <w:szCs w:val="22"/>
+          <w:bCs/>
+          <w:i w:val="0"/>
+          <w:sz w:val="22"/>
+          <w:szCs w:val="22"/>
+          <w:u w:val="none"/>
         </w:rPr>
         <w:t>)</w:t>
       </w:r>
@@ -315,18 +366,22 @@
       <w:r>
         <w:rPr>
           <w:b/>
-          <w:sz w:val="22"/>
-          <w:bCs w:val="1"/>
-          <w:szCs w:val="22"/>
+          <w:bCs/>
+          <w:i w:val="0"/>
+          <w:sz w:val="22"/>
+          <w:szCs w:val="22"/>
+          <w:u w:val="none"/>
         </w:rPr>
         <w:t>_______</w:t>
       </w:r>
       <w:r>
         <w:rPr>
           <w:b/>
-          <w:sz w:val="22"/>
-          <w:bCs w:val="1"/>
-          <w:szCs w:val="22"/>
+          <w:bCs/>
+          <w:i w:val="0"/>
+          <w:sz w:val="22"/>
+          <w:szCs w:val="22"/>
+          <w:u w:val="none"/>
         </w:rPr>
         <w:t xml:space="preserve"> </w:t>
       </w:r>
@@ -344,6 +399,10 @@
       <w:r>
         <w:rPr>
           <w:rFonts w:cs="Nirmala UI" w:eastAsia="Nirmala UI"/>
+          <w:b/>
+          <w:bCs/>
+          <w:i w:val="0"/>
+          <w:u w:val="none"/>
         </w:rPr>
         <w:t>चैयर के पुर्नवास के साथ मेटर्स ने आवाज उठाई</w:t>
       </w:r>
@@ -358,21 +417,38 @@
           <w:szCs w:val="22"/>
         </w:rPr>
       </w:pPr>
-      <w:r>
-        <w:rPr>
-          <w:b/>
-          <w:sz w:val="22"/>
-          <w:bCs w:val="1"/>
-          <w:szCs w:val="22"/>
+      <w:proofErr w:type="spellStart"/>
+      <w:proofErr w:type="spellEnd"/>
+      <w:proofErr w:type="spellStart"/>
+      <w:proofErr w:type="spellEnd"/>
+      <w:proofErr w:type="spellStart"/>
+      <w:proofErr w:type="spellEnd"/>
+      <w:proofErr w:type="spellStart"/>
+      <w:proofErr w:type="spellEnd"/>
+      <w:proofErr w:type="spellStart"/>
+      <w:proofErr w:type="spellEnd"/>
+      <w:proofErr w:type="spellStart"/>
+      <w:proofErr w:type="spellEnd"/>
+      <w:proofErr w:type="spellStart"/>
+      <w:proofErr w:type="spellEnd"/>
+      <w:r>
+        <w:rPr>
+          <w:b/>
+          <w:bCs/>
+          <w:i w:val="0"/>
+          <w:sz w:val="22"/>
+          <w:szCs w:val="22"/>
+          <w:u w:val="none"/>
         </w:rPr>
         <w:t>1.</w:t>
       </w:r>
       <w:r>
         <w:rPr>
-          <w:b/>
-          <w:sz w:val="22"/>
-          <w:bCs w:val="1"/>
-          <w:szCs w:val="22"/>
+          <w:b w:val="0"/>
+          <w:i w:val="0"/>
+          <w:sz w:val="22"/>
+          <w:szCs w:val="22"/>
+          <w:u w:val="none"/>
         </w:rPr>
         <w:t xml:space="preserve"> </w:t>
       </w:r>
@@ -380,7 +456,9 @@
         <w:rPr>
           <w:rFonts w:cs="Nirmala UI" w:eastAsia="Nirmala UI"/>
           <w:b/>
-          <w:bCs w:val="1"/>
+          <w:bCs/>
+          <w:i w:val="0"/>
+          <w:u w:val="none"/>
         </w:rPr>
         <w:t xml:space="preserve">देशद्रोह के खिलाफ आरोप </w:t>
       </w:r>
@@ -388,14 +466,18 @@
         <w:rPr>
           <w:rFonts w:cs="Nirmala UI" w:eastAsia="Nirmala UI"/>
           <w:b/>
-          <w:bCs w:val="1"/>
+          <w:bCs/>
+          <w:i w:val="0"/>
+          <w:u w:val="none"/>
         </w:rPr>
         <w:t>श्री</w:t>
       </w:r>
       <w:r>
         <w:rPr>
           <w:b/>
-          <w:bCs w:val="1"/>
+          <w:bCs/>
+          <w:i w:val="0"/>
+          <w:u w:val="none"/>
         </w:rPr>
         <w:t xml:space="preserve"> </w:t>
       </w:r>
@@ -403,14 +485,18 @@
         <w:rPr>
           <w:rFonts w:cs="Nirmala UI" w:eastAsia="Nirmala UI"/>
           <w:b/>
-          <w:bCs w:val="1"/>
+          <w:bCs/>
+          <w:i w:val="0"/>
+          <w:u w:val="none"/>
         </w:rPr>
         <w:t>सीताराम</w:t>
       </w:r>
       <w:r>
         <w:rPr>
           <w:b/>
-          <w:bCs w:val="1"/>
+          <w:bCs/>
+          <w:i w:val="0"/>
+          <w:u w:val="none"/>
         </w:rPr>
         <w:t xml:space="preserve"> </w:t>
       </w:r>
@@ -418,7 +504,9 @@
         <w:rPr>
           <w:rFonts w:cs="Nirmala UI" w:eastAsia="Nirmala UI"/>
           <w:b/>
-          <w:bCs w:val="1"/>
+          <w:bCs/>
+          <w:i w:val="0"/>
+          <w:u w:val="none"/>
         </w:rPr>
         <w:t>येचुरी</w:t>
       </w:r>
@@ -426,7 +514,9 @@
         <w:rPr>
           <w:rFonts w:cs="Nirmala UI" w:eastAsia="Nirmala UI"/>
           <w:b/>
-          <w:bCs w:val="1"/>
+          <w:bCs/>
+          <w:i w:val="0"/>
+          <w:u w:val="none"/>
         </w:rPr>
         <w:t xml:space="preserve"> और </w:t>
       </w:r>
@@ -434,7 +524,9 @@
         <w:rPr>
           <w:rFonts w:cs="Nirmala UI" w:eastAsia="Nirmala UI"/>
           <w:b/>
-          <w:bCs w:val="1"/>
+          <w:bCs/>
+          <w:i w:val="0"/>
+          <w:u w:val="none"/>
         </w:rPr>
         <w:t>श्री</w:t>
       </w:r>
@@ -442,7 +534,9 @@
         <w:rPr>
           <w:rFonts w:cs="Nirmala UI" w:eastAsia="Nirmala UI"/>
           <w:b/>
-          <w:bCs w:val="1"/>
+          <w:bCs/>
+          <w:i w:val="0"/>
+          <w:u w:val="none"/>
         </w:rPr>
         <w:t xml:space="preserve"> डी. राजा , सदस्यों और फोन पर जीवन के लिए धमकी </w:t>
       </w:r>
@@ -450,14 +544,18 @@
         <w:rPr>
           <w:rFonts w:cs="Nirmala UI" w:eastAsia="Nirmala UI"/>
           <w:b/>
-          <w:bCs w:val="1"/>
+          <w:bCs/>
+          <w:i w:val="0"/>
+          <w:u w:val="none"/>
         </w:rPr>
         <w:t>श्री</w:t>
       </w:r>
       <w:r>
         <w:rPr>
           <w:b/>
-          <w:bCs w:val="1"/>
+          <w:bCs/>
+          <w:i w:val="0"/>
+          <w:u w:val="none"/>
         </w:rPr>
         <w:t xml:space="preserve"> </w:t>
       </w:r>
@@ -465,14 +563,18 @@
         <w:rPr>
           <w:rFonts w:cs="Nirmala UI" w:eastAsia="Nirmala UI"/>
           <w:b/>
-          <w:bCs w:val="1"/>
+          <w:bCs/>
+          <w:i w:val="0"/>
+          <w:u w:val="none"/>
         </w:rPr>
         <w:t>सीताराम</w:t>
       </w:r>
       <w:r>
         <w:rPr>
           <w:b/>
-          <w:bCs w:val="1"/>
+          <w:bCs/>
+          <w:i w:val="0"/>
+          <w:u w:val="none"/>
         </w:rPr>
         <w:t xml:space="preserve"> </w:t>
       </w:r>
@@ -480,7 +582,9 @@
         <w:rPr>
           <w:rFonts w:cs="Nirmala UI" w:eastAsia="Nirmala UI"/>
           <w:b/>
-          <w:bCs w:val="1"/>
+          <w:bCs/>
+          <w:i w:val="0"/>
+          <w:u w:val="none"/>
         </w:rPr>
         <w:t>येचुरी</w:t>
       </w:r>
@@ -495,212 +599,318 @@
           <w:szCs w:val="22"/>
         </w:rPr>
       </w:pPr>
-      <w:r>
-        <w:rPr>
-          <w:sz w:val="22"/>
-          <w:szCs w:val="22"/>
+      <w:proofErr w:type="gramStart"/>
+      <w:proofErr w:type="gramEnd"/>
+      <w:proofErr w:type="spellStart"/>
+      <w:proofErr w:type="spellEnd"/>
+      <w:proofErr w:type="spellStart"/>
+      <w:proofErr w:type="spellEnd"/>
+      <w:proofErr w:type="spellStart"/>
+      <w:proofErr w:type="spellEnd"/>
+      <w:proofErr w:type="spellStart"/>
+      <w:proofErr w:type="spellEnd"/>
+      <w:proofErr w:type="spellStart"/>
+      <w:proofErr w:type="spellEnd"/>
+      <w:proofErr w:type="spellStart"/>
+      <w:proofErr w:type="spellEnd"/>
+      <w:proofErr w:type="spellStart"/>
+      <w:proofErr w:type="spellEnd"/>
+      <w:proofErr w:type="spellStart"/>
+      <w:proofErr w:type="spellEnd"/>
+      <w:proofErr w:type="spellStart"/>
+      <w:proofErr w:type="spellEnd"/>
+      <w:proofErr w:type="spellStart"/>
+      <w:proofErr w:type="spellEnd"/>
+      <w:proofErr w:type="spellStart"/>
+      <w:proofErr w:type="spellEnd"/>
+      <w:r>
+        <w:rPr>
+          <w:b w:val="0"/>
+          <w:i w:val="0"/>
+          <w:sz w:val="22"/>
+          <w:szCs w:val="22"/>
+          <w:u w:val="none"/>
         </w:rPr>
         <w:tab/>
       </w:r>
       <w:r>
         <w:rPr>
           <w:rFonts w:cs="Nirmala UI" w:eastAsia="Nirmala UI"/>
-          <w:sz w:val="22"/>
-          <w:szCs w:val="22"/>
+          <w:b/>
+          <w:bCs/>
+          <w:i w:val="0"/>
+          <w:sz w:val="22"/>
+          <w:szCs w:val="22"/>
+          <w:u w:val="none"/>
         </w:rPr>
         <w:t>श्री टी. के. रंगराजन:</w:t>
       </w:r>
       <w:r>
         <w:rPr>
           <w:rFonts w:cs="Nirmala UI" w:eastAsia="Nirmala UI"/>
-          <w:sz w:val="22"/>
-          <w:szCs w:val="22"/>
+          <w:b w:val="0"/>
+          <w:i w:val="0"/>
+          <w:sz w:val="22"/>
+          <w:szCs w:val="22"/>
+          <w:u w:val="none"/>
         </w:rPr>
         <w:t xml:space="preserve">  मैं उनके खिलाफ देशद्रोह का मामला उठाना चाहता हूं. </w:t>
       </w:r>
       <w:r>
         <w:rPr>
           <w:rFonts w:cs="Nirmala UI" w:eastAsia="Nirmala UI"/>
-          <w:sz w:val="22"/>
-          <w:szCs w:val="22"/>
+          <w:b w:val="0"/>
+          <w:i w:val="0"/>
+          <w:sz w:val="22"/>
+          <w:szCs w:val="22"/>
+          <w:u w:val="none"/>
         </w:rPr>
         <w:t>सीपीआई(</w:t>
       </w:r>
       <w:r>
         <w:rPr>
           <w:rFonts w:cs="Nirmala UI" w:eastAsia="Nirmala UI"/>
-          <w:sz w:val="22"/>
-          <w:szCs w:val="22"/>
+          <w:b w:val="0"/>
+          <w:i w:val="0"/>
+          <w:sz w:val="22"/>
+          <w:szCs w:val="22"/>
+          <w:u w:val="none"/>
         </w:rPr>
         <w:t xml:space="preserve">(एम) नेता और पार्टी के संयुक्त सचिव, </w:t>
       </w:r>
       <w:r>
         <w:rPr>
           <w:rFonts w:cs="Nirmala UI" w:eastAsia="Nirmala UI"/>
-          <w:sz w:val="22"/>
-          <w:szCs w:val="22"/>
+          <w:b w:val="0"/>
+          <w:i w:val="0"/>
+          <w:sz w:val="22"/>
+          <w:szCs w:val="22"/>
+          <w:u w:val="none"/>
         </w:rPr>
         <w:t>श्री</w:t>
       </w:r>
       <w:r>
         <w:rPr>
-          <w:sz w:val="22"/>
-          <w:szCs w:val="22"/>
+          <w:b w:val="0"/>
+          <w:i w:val="0"/>
+          <w:sz w:val="22"/>
+          <w:szCs w:val="22"/>
+          <w:u w:val="none"/>
         </w:rPr>
         <w:t xml:space="preserve"> </w:t>
       </w:r>
       <w:r>
         <w:rPr>
           <w:rFonts w:cs="Nirmala UI" w:eastAsia="Nirmala UI"/>
-          <w:sz w:val="22"/>
-          <w:szCs w:val="22"/>
+          <w:b w:val="0"/>
+          <w:i w:val="0"/>
+          <w:sz w:val="22"/>
+          <w:szCs w:val="22"/>
+          <w:u w:val="none"/>
         </w:rPr>
         <w:t>सीताराम</w:t>
       </w:r>
       <w:r>
         <w:rPr>
-          <w:sz w:val="22"/>
-          <w:szCs w:val="22"/>
+          <w:b w:val="0"/>
+          <w:i w:val="0"/>
+          <w:sz w:val="22"/>
+          <w:szCs w:val="22"/>
+          <w:u w:val="none"/>
         </w:rPr>
         <w:t xml:space="preserve"> </w:t>
       </w:r>
       <w:r>
         <w:rPr>
           <w:rFonts w:cs="Nirmala UI" w:eastAsia="Nirmala UI"/>
-          <w:sz w:val="22"/>
-          <w:szCs w:val="22"/>
+          <w:b w:val="0"/>
+          <w:i w:val="0"/>
+          <w:sz w:val="22"/>
+          <w:szCs w:val="22"/>
+          <w:u w:val="none"/>
         </w:rPr>
         <w:t>येचुरी</w:t>
       </w:r>
       <w:r>
         <w:rPr>
           <w:rFonts w:cs="Nirmala UI" w:eastAsia="Nirmala UI"/>
-          <w:sz w:val="22"/>
-          <w:szCs w:val="22"/>
+          <w:b w:val="0"/>
+          <w:i w:val="0"/>
+          <w:sz w:val="22"/>
+          <w:szCs w:val="22"/>
+          <w:u w:val="none"/>
         </w:rPr>
         <w:t xml:space="preserve">, और हान. इस सदन के सदस्य., </w:t>
       </w:r>
       <w:r>
         <w:rPr>
           <w:rFonts w:cs="Nirmala UI" w:eastAsia="Nirmala UI"/>
-          <w:sz w:val="22"/>
-          <w:szCs w:val="22"/>
+          <w:b w:val="0"/>
+          <w:i w:val="0"/>
+          <w:sz w:val="22"/>
+          <w:szCs w:val="22"/>
+          <w:u w:val="none"/>
         </w:rPr>
         <w:t>श्री</w:t>
       </w:r>
       <w:r>
         <w:rPr>
           <w:rFonts w:cs="Nirmala UI" w:eastAsia="Nirmala UI"/>
-          <w:sz w:val="22"/>
-          <w:szCs w:val="22"/>
+          <w:b w:val="0"/>
+          <w:i w:val="0"/>
+          <w:sz w:val="22"/>
+          <w:szCs w:val="22"/>
+          <w:u w:val="none"/>
         </w:rPr>
         <w:t xml:space="preserve"> डी. राजा और </w:t>
       </w:r>
       <w:r>
         <w:rPr>
           <w:rFonts w:cs="Nirmala UI" w:eastAsia="Nirmala UI"/>
-          <w:sz w:val="22"/>
-          <w:szCs w:val="22"/>
+          <w:b w:val="0"/>
+          <w:i w:val="0"/>
+          <w:sz w:val="22"/>
+          <w:szCs w:val="22"/>
+          <w:u w:val="none"/>
         </w:rPr>
         <w:t>श्री</w:t>
       </w:r>
       <w:r>
         <w:rPr>
-          <w:sz w:val="22"/>
-          <w:szCs w:val="22"/>
+          <w:b w:val="0"/>
+          <w:i w:val="0"/>
+          <w:sz w:val="22"/>
+          <w:szCs w:val="22"/>
+          <w:u w:val="none"/>
         </w:rPr>
         <w:t xml:space="preserve"> K.C. </w:t>
       </w:r>
       <w:r>
         <w:rPr>
           <w:rFonts w:cs="Nirmala UI" w:eastAsia="Nirmala UI"/>
-          <w:sz w:val="22"/>
-          <w:szCs w:val="22"/>
+          <w:b w:val="0"/>
+          <w:i w:val="0"/>
+          <w:sz w:val="22"/>
+          <w:szCs w:val="22"/>
+          <w:u w:val="none"/>
         </w:rPr>
         <w:t>टाइप</w:t>
       </w:r>
       <w:r>
         <w:rPr>
           <w:rFonts w:cs="Nirmala UI" w:eastAsia="Nirmala UI"/>
-          <w:sz w:val="22"/>
-          <w:szCs w:val="22"/>
+          <w:b w:val="0"/>
+          <w:i w:val="0"/>
+          <w:sz w:val="22"/>
+          <w:szCs w:val="22"/>
+          <w:u w:val="none"/>
         </w:rPr>
         <w:t xml:space="preserve">. हमने देश की आजादी के लिए लड़ाई लड़ी है। हमारी राजनीतिक अखंडता की परंपरा रही है। इस घर में, हॉन। मंत्री और सदस्य बिना किसी प्रामाणिक सबूत के भाषण देते हैं । अब , इन सभी भाषणों के परिणामस्वरूप खतरा पैदा हुआ है </w:t>
       </w:r>
       <w:r>
         <w:rPr>
           <w:rFonts w:cs="Nirmala UI" w:eastAsia="Nirmala UI"/>
-          <w:sz w:val="22"/>
-          <w:szCs w:val="22"/>
+          <w:b w:val="0"/>
+          <w:i w:val="0"/>
+          <w:sz w:val="22"/>
+          <w:szCs w:val="22"/>
+          <w:u w:val="none"/>
         </w:rPr>
         <w:t>श्री</w:t>
       </w:r>
       <w:r>
         <w:rPr>
-          <w:sz w:val="22"/>
-          <w:szCs w:val="22"/>
+          <w:b w:val="0"/>
+          <w:i w:val="0"/>
+          <w:sz w:val="22"/>
+          <w:szCs w:val="22"/>
+          <w:u w:val="none"/>
         </w:rPr>
         <w:t xml:space="preserve"> </w:t>
       </w:r>
       <w:r>
         <w:rPr>
           <w:rFonts w:cs="Nirmala UI" w:eastAsia="Nirmala UI"/>
-          <w:sz w:val="22"/>
-          <w:szCs w:val="22"/>
+          <w:b w:val="0"/>
+          <w:i w:val="0"/>
+          <w:sz w:val="22"/>
+          <w:szCs w:val="22"/>
+          <w:u w:val="none"/>
         </w:rPr>
         <w:t>सीताराम की है.</w:t>
       </w:r>
       <w:r>
         <w:rPr>
           <w:rFonts w:cs="Nirmala UI" w:eastAsia="Nirmala UI"/>
-          <w:sz w:val="22"/>
-          <w:szCs w:val="22"/>
+          <w:b w:val="0"/>
+          <w:i w:val="0"/>
+          <w:sz w:val="22"/>
+          <w:szCs w:val="22"/>
+          <w:u w:val="none"/>
         </w:rPr>
         <w:t xml:space="preserve"> मैं जानना चाहूंगा कि क्या अध्यक्ष को गिरफ्तारी के बारे में कोई नोटिस मिला है . . </w:t>
       </w:r>
       <w:r>
         <w:rPr>
           <w:rFonts w:cs="Nirmala UI" w:eastAsia="Nirmala UI"/>
-          <w:sz w:val="22"/>
-          <w:szCs w:val="22"/>
+          <w:b w:val="0"/>
+          <w:i w:val="0"/>
+          <w:sz w:val="22"/>
+          <w:szCs w:val="22"/>
+          <w:u w:val="none"/>
         </w:rPr>
         <w:t>श्री</w:t>
       </w:r>
       <w:r>
         <w:rPr>
-          <w:sz w:val="22"/>
-          <w:szCs w:val="22"/>
+          <w:b w:val="0"/>
+          <w:i w:val="0"/>
+          <w:sz w:val="22"/>
+          <w:szCs w:val="22"/>
+          <w:u w:val="none"/>
         </w:rPr>
         <w:t xml:space="preserve"> </w:t>
       </w:r>
       <w:r>
         <w:rPr>
           <w:rFonts w:cs="Nirmala UI" w:eastAsia="Nirmala UI"/>
-          <w:sz w:val="22"/>
-          <w:szCs w:val="22"/>
+          <w:b w:val="0"/>
+          <w:i w:val="0"/>
+          <w:sz w:val="22"/>
+          <w:szCs w:val="22"/>
+          <w:u w:val="none"/>
         </w:rPr>
         <w:t>सीताराम</w:t>
       </w:r>
       <w:r>
         <w:rPr>
-          <w:sz w:val="22"/>
-          <w:szCs w:val="22"/>
+          <w:b w:val="0"/>
+          <w:i w:val="0"/>
+          <w:sz w:val="22"/>
+          <w:szCs w:val="22"/>
+          <w:u w:val="none"/>
         </w:rPr>
         <w:t xml:space="preserve"> </w:t>
       </w:r>
       <w:r>
         <w:rPr>
           <w:rFonts w:cs="Nirmala UI" w:eastAsia="Nirmala UI"/>
-          <w:sz w:val="22"/>
-          <w:szCs w:val="22"/>
+          <w:b w:val="0"/>
+          <w:i w:val="0"/>
+          <w:sz w:val="22"/>
+          <w:szCs w:val="22"/>
+          <w:u w:val="none"/>
         </w:rPr>
         <w:t>येचुरी</w:t>
       </w:r>
       <w:r>
         <w:rPr>
           <w:rFonts w:cs="Nirmala UI" w:eastAsia="Nirmala UI"/>
-          <w:sz w:val="22"/>
-          <w:szCs w:val="22"/>
+          <w:b w:val="0"/>
+          <w:i w:val="0"/>
+          <w:sz w:val="22"/>
+          <w:szCs w:val="22"/>
+          <w:u w:val="none"/>
         </w:rPr>
         <w:t xml:space="preserve"> और अन्य.</w:t>
       </w:r>
@@ -716,33 +926,41 @@
           <w:szCs w:val="22"/>
         </w:rPr>
       </w:pPr>
-      <w:r>
-        <w:rPr>
-          <w:rFonts w:cs="Nirmala UI" w:eastAsia="Nirmala UI"/>
+      <w:proofErr w:type="spellStart"/>
+      <w:proofErr w:type="spellEnd"/>
+      <w:r>
+        <w:rPr>
+          <w:rFonts w:cs="Nirmala UI" w:eastAsia="Nirmala UI"/>
+          <w:b w:val="0"/>
           <w:i/>
-          <w:sz w:val="22"/>
-          <w:iCs w:val="1"/>
-          <w:szCs w:val="22"/>
+          <w:iCs/>
+          <w:sz w:val="22"/>
+          <w:szCs w:val="22"/>
+          <w:u w:val="none"/>
         </w:rPr>
         <w:t xml:space="preserve">(कई </w:t>
       </w:r>
       <w:r>
         <w:rPr>
           <w:rFonts w:cs="Nirmala UI" w:eastAsia="Nirmala UI"/>
+          <w:b w:val="0"/>
           <w:i/>
-          <w:sz w:val="22"/>
-          <w:iCs w:val="1"/>
-          <w:szCs w:val="22"/>
+          <w:iCs/>
+          <w:sz w:val="22"/>
+          <w:szCs w:val="22"/>
+          <w:u w:val="none"/>
         </w:rPr>
         <w:t>हो सकता है</w:t>
       </w:r>
       <w:r>
         <w:rPr>
           <w:rFonts w:cs="Nirmala UI" w:eastAsia="Nirmala UI"/>
+          <w:b w:val="0"/>
           <w:i/>
-          <w:sz w:val="22"/>
-          <w:iCs w:val="1"/>
-          <w:szCs w:val="22"/>
+          <w:iCs/>
+          <w:sz w:val="22"/>
+          <w:szCs w:val="22"/>
+          <w:u w:val="none"/>
         </w:rPr>
         <w:t xml:space="preserve"> संबंधित सदस्य..)</w:t>
       </w:r>
@@ -757,11 +975,15 @@
           <w:szCs w:val="20"/>
         </w:rPr>
       </w:pPr>
-      <w:r>
-        <w:rPr>
-          <w:rFonts w:cs="Nirmala UI" w:eastAsia="Nirmala UI"/>
-          <w:b/>
-          <w:bCs w:val="1"/>
+      <w:proofErr w:type="spellStart"/>
+      <w:proofErr w:type="spellEnd"/>
+      <w:r>
+        <w:rPr>
+          <w:rFonts w:cs="Nirmala UI" w:eastAsia="Nirmala UI"/>
+          <w:b/>
+          <w:bCs/>
+          <w:i w:val="0"/>
+          <w:u w:val="none"/>
         </w:rPr>
         <w:t xml:space="preserve">2. कुछ महिलाओं के साथ छेड़खानी का आरोप </w:t>
       </w:r>
@@ -769,14 +991,18 @@
         <w:rPr>
           <w:rFonts w:cs="Nirmala UI" w:eastAsia="Nirmala UI"/>
           <w:b/>
-          <w:bCs w:val="1"/>
+          <w:bCs/>
+          <w:i w:val="0"/>
+          <w:u w:val="none"/>
         </w:rPr>
         <w:t>मुरथल</w:t>
       </w:r>
       <w:r>
         <w:rPr>
           <w:b/>
-          <w:bCs w:val="1"/>
+          <w:bCs/>
+          <w:i w:val="0"/>
+          <w:u w:val="none"/>
         </w:rPr>
         <w:t>,</w:t>
       </w:r>
@@ -784,16 +1010,19 @@
         <w:rPr>
           <w:rFonts w:cs="Nirmala UI" w:eastAsia="Nirmala UI"/>
           <w:b/>
-          <w:bCs w:val="1"/>
+          <w:bCs/>
+          <w:i w:val="0"/>
+          <w:u w:val="none"/>
         </w:rPr>
         <w:t xml:space="preserve"> 22.02.2016 को हरियाणा एंटी सोशल एलिमेंट्स द्वारा</w:t>
       </w:r>
       <w:r>
         <w:rPr>
-          <w:b/>
+          <w:b w:val="0"/>
+          <w:i w:val="0"/>
           <w:sz w:val="20"/>
-          <w:bCs w:val="1"/>
           <w:szCs w:val="20"/>
+          <w:u w:val="none"/>
         </w:rPr>
         <w:t xml:space="preserve"> </w:t>
       </w:r>
@@ -808,66 +1037,95 @@
           <w:szCs w:val="22"/>
         </w:rPr>
       </w:pPr>
-      <w:r>
-        <w:rPr>
-          <w:sz w:val="22"/>
-          <w:szCs w:val="22"/>
+      <w:proofErr w:type="gramStart"/>
+      <w:proofErr w:type="gramEnd"/>
+      <w:proofErr w:type="spellStart"/>
+      <w:proofErr w:type="spellEnd"/>
+      <w:r>
+        <w:rPr>
+          <w:b w:val="0"/>
+          <w:i w:val="0"/>
+          <w:sz w:val="22"/>
+          <w:szCs w:val="22"/>
+          <w:u w:val="none"/>
         </w:rPr>
         <w:tab/>
       </w:r>
       <w:r>
         <w:rPr>
           <w:rFonts w:cs="Nirmala UI" w:eastAsia="Nirmala UI"/>
-          <w:sz w:val="22"/>
-          <w:szCs w:val="22"/>
+          <w:b/>
+          <w:bCs/>
+          <w:i w:val="0"/>
+          <w:sz w:val="22"/>
+          <w:szCs w:val="22"/>
+          <w:u w:val="none"/>
         </w:rPr>
         <w:t xml:space="preserve"> कुमारी सिलजा: </w:t>
       </w:r>
       <w:r>
         <w:rPr>
           <w:rFonts w:cs="Nirmala UI" w:eastAsia="Nirmala UI"/>
-          <w:sz w:val="22"/>
-          <w:szCs w:val="22"/>
+          <w:b w:val="0"/>
+          <w:i w:val="0"/>
+          <w:sz w:val="22"/>
+          <w:szCs w:val="22"/>
+          <w:u w:val="none"/>
         </w:rPr>
         <w:t>हरियाणा में बहुत ही शर्मनाक कार्य हुए हैं</w:t>
       </w:r>
       <w:r>
         <w:rPr>
           <w:rFonts w:cs="Nirmala UI" w:eastAsia="Nirmala UI"/>
-          <w:sz w:val="22"/>
-          <w:szCs w:val="22"/>
+          <w:b w:val="0"/>
+          <w:i w:val="0"/>
+          <w:sz w:val="22"/>
+          <w:szCs w:val="22"/>
+          <w:u w:val="none"/>
         </w:rPr>
         <w:t xml:space="preserve">  हाल ही में</w:t>
       </w:r>
       <w:r>
         <w:rPr>
           <w:rFonts w:cs="Nirmala UI" w:eastAsia="Nirmala UI"/>
-          <w:sz w:val="22"/>
-          <w:szCs w:val="22"/>
+          <w:b w:val="0"/>
+          <w:i w:val="0"/>
+          <w:sz w:val="22"/>
+          <w:szCs w:val="22"/>
+          <w:u w:val="none"/>
         </w:rPr>
         <w:t xml:space="preserve">. प्रदेश में कानून व्यवस्था नहीं है। सरकार मूक दर्शक है । घटना की </w:t>
       </w:r>
       <w:r>
         <w:rPr>
           <w:rFonts w:cs="Nirmala UI" w:eastAsia="Nirmala UI"/>
-          <w:sz w:val="22"/>
-          <w:szCs w:val="22"/>
+          <w:b w:val="0"/>
+          <w:i w:val="0"/>
+          <w:sz w:val="22"/>
+          <w:szCs w:val="22"/>
+          <w:u w:val="none"/>
         </w:rPr>
         <w:t>मुरथल</w:t>
       </w:r>
       <w:r>
         <w:rPr>
           <w:rFonts w:cs="Nirmala UI" w:eastAsia="Nirmala UI"/>
-          <w:sz w:val="22"/>
-          <w:szCs w:val="22"/>
+          <w:b w:val="0"/>
+          <w:i w:val="0"/>
+          <w:sz w:val="22"/>
+          <w:szCs w:val="22"/>
+          <w:u w:val="none"/>
         </w:rPr>
         <w:t xml:space="preserve"> हर किसी की अंतरात्मा को हिला दिया है । मामले का संज्ञान लेते हुए </w:t>
       </w:r>
       <w:r>
         <w:rPr>
           <w:rFonts w:cs="Nirmala UI" w:eastAsia="Nirmala UI"/>
-          <w:sz w:val="22"/>
-          <w:szCs w:val="22"/>
+          <w:b w:val="0"/>
+          <w:i w:val="0"/>
+          <w:sz w:val="22"/>
+          <w:szCs w:val="22"/>
+          <w:u w:val="none"/>
         </w:rPr>
         <w:t>हाईकोर्ट ने हरियाणा सरकार को नोटिस जारी कर मामले की न्यायिक जांच करने को कहा है। लेकिन हमें हरियाणा सरकार पर भरोसा नहीं है। हम इस मामले की न्यायिक जांच की मांग करते हैं ताकि तथ्यों को सामने लाया जा सके.</w:t>
       </w:r>
@@ -882,40 +1140,51 @@
           <w:szCs w:val="22"/>
         </w:rPr>
       </w:pPr>
-      <w:r>
-        <w:rPr>
-          <w:sz w:val="22"/>
-          <w:szCs w:val="22"/>
+      <w:proofErr w:type="spellStart"/>
+      <w:proofErr w:type="spellEnd"/>
+      <w:r>
+        <w:rPr>
+          <w:b w:val="0"/>
+          <w:i w:val="0"/>
+          <w:sz w:val="22"/>
+          <w:szCs w:val="22"/>
+          <w:u w:val="none"/>
         </w:rPr>
         <w:tab/>
       </w:r>
       <w:r>
         <w:rPr>
           <w:rFonts w:cs="Nirmala UI" w:eastAsia="Nirmala UI"/>
+          <w:b w:val="0"/>
           <w:i/>
-          <w:sz w:val="22"/>
-          <w:iCs w:val="1"/>
-          <w:szCs w:val="22"/>
+          <w:iCs/>
+          <w:sz w:val="22"/>
+          <w:szCs w:val="22"/>
+          <w:u w:val="none"/>
         </w:rPr>
         <w:t xml:space="preserve">(कई </w:t>
       </w:r>
       <w:r>
         <w:rPr>
           <w:rFonts w:cs="Nirmala UI" w:eastAsia="Nirmala UI"/>
+          <w:b w:val="0"/>
           <w:i/>
-          <w:sz w:val="22"/>
-          <w:iCs w:val="1"/>
-          <w:szCs w:val="22"/>
+          <w:iCs/>
+          <w:sz w:val="22"/>
+          <w:szCs w:val="22"/>
+          <w:u w:val="none"/>
         </w:rPr>
         <w:t>हो सकता है</w:t>
       </w:r>
       <w:r>
         <w:rPr>
           <w:rFonts w:cs="Nirmala UI" w:eastAsia="Nirmala UI"/>
+          <w:b w:val="0"/>
           <w:i/>
-          <w:sz w:val="22"/>
-          <w:iCs w:val="1"/>
-          <w:szCs w:val="22"/>
+          <w:iCs/>
+          <w:sz w:val="22"/>
+          <w:szCs w:val="22"/>
+          <w:u w:val="none"/>
         </w:rPr>
         <w:t xml:space="preserve"> संबंधित सदस्य..)</w:t>
       </w:r>
@@ -930,21 +1199,28 @@
           <w:szCs w:val="22"/>
         </w:rPr>
       </w:pPr>
-      <w:r>
-        <w:rPr>
-          <w:b/>
-          <w:sz w:val="22"/>
-          <w:bCs w:val="1"/>
-          <w:szCs w:val="22"/>
+      <w:proofErr w:type="spellStart"/>
+      <w:proofErr w:type="spellEnd"/>
+      <w:proofErr w:type="spellStart"/>
+      <w:proofErr w:type="spellEnd"/>
+      <w:r>
+        <w:rPr>
+          <w:b/>
+          <w:bCs/>
+          <w:i w:val="0"/>
+          <w:sz w:val="22"/>
+          <w:szCs w:val="22"/>
+          <w:u w:val="none"/>
         </w:rPr>
         <w:t>3.</w:t>
       </w:r>
       <w:r>
         <w:rPr>
-          <w:b/>
-          <w:sz w:val="22"/>
-          <w:bCs w:val="1"/>
-          <w:szCs w:val="22"/>
+          <w:b w:val="0"/>
+          <w:i w:val="0"/>
+          <w:sz w:val="22"/>
+          <w:szCs w:val="22"/>
+          <w:u w:val="none"/>
         </w:rPr>
         <w:t xml:space="preserve"> </w:t>
       </w:r>
@@ -952,9 +1228,11 @@
         <w:rPr>
           <w:rFonts w:cs="Nirmala UI" w:eastAsia="Nirmala UI"/>
           <w:b/>
-          <w:sz w:val="22"/>
-          <w:bCs w:val="1"/>
-          <w:szCs w:val="22"/>
+          <w:bCs/>
+          <w:i w:val="0"/>
+          <w:sz w:val="22"/>
+          <w:szCs w:val="22"/>
+          <w:u w:val="none"/>
         </w:rPr>
         <w:t xml:space="preserve">भूमि खोने वालों के बीच असंतोष . . </w:t>
       </w:r>
@@ -962,9 +1240,11 @@
         <w:rPr>
           <w:rFonts w:cs="Nirmala UI" w:eastAsia="Nirmala UI"/>
           <w:b/>
-          <w:sz w:val="22"/>
-          <w:bCs w:val="1"/>
-          <w:szCs w:val="22"/>
+          <w:bCs/>
+          <w:i w:val="0"/>
+          <w:sz w:val="22"/>
+          <w:szCs w:val="22"/>
+          <w:u w:val="none"/>
         </w:rPr>
         <w:t>माल्थन</w:t>
       </w:r>
@@ -972,9 +1252,11 @@
         <w:rPr>
           <w:rFonts w:cs="Nirmala UI" w:eastAsia="Nirmala UI"/>
           <w:b/>
-          <w:sz w:val="22"/>
-          <w:bCs w:val="1"/>
-          <w:szCs w:val="22"/>
+          <w:bCs/>
+          <w:i w:val="0"/>
+          <w:sz w:val="22"/>
+          <w:szCs w:val="22"/>
+          <w:u w:val="none"/>
         </w:rPr>
         <w:t xml:space="preserve"> पावर स्टेशन में </w:t>
       </w:r>
@@ -982,9 +1264,11 @@
         <w:rPr>
           <w:rFonts w:cs="Nirmala UI" w:eastAsia="Nirmala UI"/>
           <w:b/>
-          <w:sz w:val="22"/>
-          <w:bCs w:val="1"/>
-          <w:szCs w:val="22"/>
+          <w:bCs/>
+          <w:i w:val="0"/>
+          <w:sz w:val="22"/>
+          <w:szCs w:val="22"/>
+          <w:u w:val="none"/>
         </w:rPr>
         <w:t>धनबाद</w:t>
       </w:r>
@@ -992,9 +1276,11 @@
         <w:rPr>
           <w:rFonts w:cs="Nirmala UI" w:eastAsia="Nirmala UI"/>
           <w:b/>
-          <w:sz w:val="22"/>
-          <w:bCs w:val="1"/>
-          <w:szCs w:val="22"/>
+          <w:bCs/>
+          <w:i w:val="0"/>
+          <w:sz w:val="22"/>
+          <w:szCs w:val="22"/>
+          <w:u w:val="none"/>
         </w:rPr>
         <w:t>, झारखंड</w:t>
       </w:r>
@@ -1009,82 +1295,121 @@
           <w:szCs w:val="22"/>
         </w:rPr>
       </w:pPr>
-      <w:r>
-        <w:rPr>
-          <w:sz w:val="22"/>
-          <w:szCs w:val="22"/>
+      <w:proofErr w:type="spellStart"/>
+      <w:proofErr w:type="spellEnd"/>
+      <w:proofErr w:type="spellStart"/>
+      <w:proofErr w:type="spellEnd"/>
+      <w:proofErr w:type="spellStart"/>
+      <w:proofErr w:type="gramStart"/>
+      <w:proofErr w:type="spellEnd"/>
+      <w:proofErr w:type="gramEnd"/>
+      <w:r>
+        <w:rPr>
+          <w:b w:val="0"/>
+          <w:i w:val="0"/>
+          <w:sz w:val="22"/>
+          <w:szCs w:val="22"/>
+          <w:u w:val="none"/>
         </w:rPr>
         <w:tab/>
       </w:r>
       <w:r>
         <w:rPr>
           <w:rFonts w:cs="Nirmala UI" w:eastAsia="Nirmala UI"/>
-          <w:sz w:val="22"/>
-          <w:szCs w:val="22"/>
+          <w:b/>
+          <w:bCs/>
+          <w:i w:val="0"/>
+          <w:sz w:val="22"/>
+          <w:szCs w:val="22"/>
+          <w:u w:val="none"/>
         </w:rPr>
         <w:t xml:space="preserve">श्री सांजीव कुमार: </w:t>
       </w:r>
       <w:r>
         <w:rPr>
           <w:rFonts w:cs="Nirmala UI" w:eastAsia="Nirmala UI"/>
-          <w:sz w:val="22"/>
-          <w:szCs w:val="22"/>
+          <w:b w:val="0"/>
+          <w:i w:val="0"/>
+          <w:sz w:val="22"/>
+          <w:szCs w:val="22"/>
+          <w:u w:val="none"/>
         </w:rPr>
         <w:t xml:space="preserve">1050 मेगावॉट बिजली संयंत्र के लिए हजारों एकड़ भूमि का अधिग्रहण किया गया है </w:t>
       </w:r>
       <w:r>
         <w:rPr>
           <w:rFonts w:cs="Nirmala UI" w:eastAsia="Nirmala UI"/>
-          <w:sz w:val="22"/>
-          <w:szCs w:val="22"/>
+          <w:b w:val="0"/>
+          <w:i w:val="0"/>
+          <w:sz w:val="22"/>
+          <w:szCs w:val="22"/>
+          <w:u w:val="none"/>
         </w:rPr>
         <w:t>निरसा</w:t>
       </w:r>
       <w:r>
         <w:rPr>
           <w:rFonts w:cs="Nirmala UI" w:eastAsia="Nirmala UI"/>
-          <w:sz w:val="22"/>
-          <w:szCs w:val="22"/>
+          <w:b w:val="0"/>
+          <w:i w:val="0"/>
+          <w:sz w:val="22"/>
+          <w:szCs w:val="22"/>
+          <w:u w:val="none"/>
         </w:rPr>
         <w:t xml:space="preserve"> में </w:t>
       </w:r>
       <w:r>
         <w:rPr>
           <w:rFonts w:cs="Nirmala UI" w:eastAsia="Nirmala UI"/>
-          <w:sz w:val="22"/>
-          <w:szCs w:val="22"/>
+          <w:b w:val="0"/>
+          <w:i w:val="0"/>
+          <w:sz w:val="22"/>
+          <w:szCs w:val="22"/>
+          <w:u w:val="none"/>
         </w:rPr>
         <w:t>धनबाद</w:t>
       </w:r>
       <w:r>
         <w:rPr>
           <w:rFonts w:cs="Nirmala UI" w:eastAsia="Nirmala UI"/>
-          <w:sz w:val="22"/>
-          <w:szCs w:val="22"/>
+          <w:b w:val="0"/>
+          <w:i w:val="0"/>
+          <w:sz w:val="22"/>
+          <w:szCs w:val="22"/>
+          <w:u w:val="none"/>
         </w:rPr>
         <w:t xml:space="preserve"> झारखंड का जिला प्राप्त करते समय </w:t>
       </w:r>
       <w:r>
         <w:rPr>
           <w:rFonts w:cs="Nirmala UI" w:eastAsia="Nirmala UI"/>
-          <w:sz w:val="22"/>
-          <w:szCs w:val="22"/>
+          <w:b w:val="0"/>
+          <w:i w:val="0"/>
+          <w:sz w:val="22"/>
+          <w:szCs w:val="22"/>
+          <w:u w:val="none"/>
         </w:rPr>
         <w:t>भूमि</w:t>
       </w:r>
       <w:r>
         <w:rPr>
           <w:rFonts w:cs="Nirmala UI" w:eastAsia="Nirmala UI"/>
-          <w:sz w:val="22"/>
-          <w:szCs w:val="22"/>
+          <w:b w:val="0"/>
+          <w:i w:val="0"/>
+          <w:sz w:val="22"/>
+          <w:szCs w:val="22"/>
+          <w:u w:val="none"/>
         </w:rPr>
         <w:t>,ए</w:t>
       </w:r>
       <w:r>
         <w:rPr>
           <w:rFonts w:cs="Nirmala UI" w:eastAsia="Nirmala UI"/>
-          <w:sz w:val="22"/>
-          <w:szCs w:val="22"/>
+          <w:b w:val="0"/>
+          <w:i w:val="0"/>
+          <w:sz w:val="22"/>
+          <w:szCs w:val="22"/>
+          <w:u w:val="none"/>
         </w:rPr>
         <w:t xml:space="preserve"> जिन किसानों की भूमि अधिग्रहित की जा रही थी , उनके परिवार के सदस्यों को योग्यता के आधार पर नौकरी देने का वादा किया गया था । लेकिन अभी तक बहुत कम लोगों को ही रोजगार मिला है। मैं मांग करता हूं कि जिन किसानों की भूमि अधिग्रहित की गई है उन्हें योग्यता के आधार पर नौकरी दी जाए और उन्हें चिकित्सा सुविधा भी दी जाए. </w:t>
       </w:r>
@@ -1099,10 +1424,19 @@
           <w:szCs w:val="22"/>
         </w:rPr>
       </w:pPr>
-      <w:r>
-        <w:rPr>
-          <w:sz w:val="22"/>
-          <w:szCs w:val="22"/>
+      <w:proofErr w:type="spellStart"/>
+      <w:proofErr w:type="spellEnd"/>
+      <w:proofErr w:type="spellStart"/>
+      <w:proofErr w:type="spellEnd"/>
+      <w:proofErr w:type="spellStart"/>
+      <w:proofErr w:type="spellEnd"/>
+      <w:r>
+        <w:rPr>
+          <w:b w:val="0"/>
+          <w:i w:val="0"/>
+          <w:sz w:val="22"/>
+          <w:szCs w:val="22"/>
+          <w:u w:val="none"/>
         </w:rPr>
         <w:tab/>
         <w:t>(</w:t>
@@ -1110,55 +1444,80 @@
       <w:r>
         <w:rPr>
           <w:rFonts w:cs="Nirmala UI" w:eastAsia="Nirmala UI"/>
-          <w:sz w:val="22"/>
-          <w:szCs w:val="22"/>
+          <w:b w:val="0"/>
+          <w:i/>
+          <w:iCs/>
+          <w:sz w:val="22"/>
+          <w:szCs w:val="22"/>
+          <w:u w:val="none"/>
         </w:rPr>
         <w:t>श्रीमती.</w:t>
       </w:r>
       <w:r>
         <w:rPr>
-          <w:sz w:val="22"/>
-          <w:szCs w:val="22"/>
+          <w:b w:val="0"/>
+          <w:i/>
+          <w:iCs/>
+          <w:sz w:val="22"/>
+          <w:szCs w:val="22"/>
+          <w:u w:val="none"/>
         </w:rPr>
         <w:t xml:space="preserve"> </w:t>
       </w:r>
       <w:r>
         <w:rPr>
           <w:rFonts w:cs="Nirmala UI" w:eastAsia="Nirmala UI"/>
-          <w:sz w:val="22"/>
-          <w:szCs w:val="22"/>
+          <w:b w:val="0"/>
+          <w:i/>
+          <w:iCs/>
+          <w:sz w:val="22"/>
+          <w:szCs w:val="22"/>
+          <w:u w:val="none"/>
         </w:rPr>
         <w:t>कहशान.</w:t>
       </w:r>
       <w:r>
         <w:rPr>
-          <w:sz w:val="22"/>
-          <w:szCs w:val="22"/>
+          <w:b w:val="0"/>
+          <w:i/>
+          <w:iCs/>
+          <w:sz w:val="22"/>
+          <w:szCs w:val="22"/>
+          <w:u w:val="none"/>
         </w:rPr>
         <w:t xml:space="preserve"> </w:t>
       </w:r>
       <w:r>
         <w:rPr>
           <w:rFonts w:cs="Nirmala UI" w:eastAsia="Nirmala UI"/>
-          <w:sz w:val="22"/>
-          <w:szCs w:val="22"/>
+          <w:b w:val="0"/>
+          <w:i/>
+          <w:iCs/>
+          <w:sz w:val="22"/>
+          <w:szCs w:val="22"/>
+          <w:u w:val="none"/>
         </w:rPr>
         <w:t>परवीन</w:t>
       </w:r>
       <w:r>
         <w:rPr>
-          <w:sz w:val="22"/>
-          <w:szCs w:val="22"/>
+          <w:b w:val="0"/>
+          <w:i w:val="0"/>
+          <w:sz w:val="22"/>
+          <w:szCs w:val="22"/>
+          <w:u w:val="none"/>
         </w:rPr>
         <w:t xml:space="preserve"> </w:t>
       </w:r>
       <w:r>
         <w:rPr>
           <w:rFonts w:cs="Nirmala UI" w:eastAsia="Nirmala UI"/>
+          <w:b w:val="0"/>
           <w:i/>
-          <w:sz w:val="22"/>
-          <w:iCs w:val="1"/>
-          <w:szCs w:val="22"/>
+          <w:iCs/>
+          <w:sz w:val="22"/>
+          <w:szCs w:val="22"/>
+          <w:u w:val="none"/>
         </w:rPr>
         <w:t>सहायक.)</w:t>
       </w:r>
@@ -1176,18 +1535,21 @@
       <w:r>
         <w:rPr>
           <w:b/>
-          <w:sz w:val="22"/>
-          <w:bCs w:val="1"/>
-          <w:szCs w:val="22"/>
+          <w:bCs/>
+          <w:i w:val="0"/>
+          <w:sz w:val="22"/>
+          <w:szCs w:val="22"/>
+          <w:u w:val="none"/>
         </w:rPr>
         <w:t>4.</w:t>
       </w:r>
       <w:r>
         <w:rPr>
-          <w:b/>
-          <w:sz w:val="22"/>
-          <w:bCs w:val="1"/>
-          <w:szCs w:val="22"/>
+          <w:b w:val="0"/>
+          <w:i w:val="0"/>
+          <w:sz w:val="22"/>
+          <w:szCs w:val="22"/>
+          <w:u w:val="none"/>
         </w:rPr>
         <w:t xml:space="preserve"> </w:t>
       </w:r>
@@ -1195,18 +1557,22 @@
         <w:rPr>
           <w:rFonts w:cs="Nirmala UI" w:eastAsia="Nirmala UI"/>
           <w:b/>
-          <w:sz w:val="22"/>
-          <w:bCs w:val="1"/>
-          <w:szCs w:val="22"/>
+          <w:bCs/>
+          <w:i w:val="0"/>
+          <w:sz w:val="22"/>
+          <w:szCs w:val="22"/>
+          <w:u w:val="none"/>
         </w:rPr>
         <w:t>तेल की कमी को लेकर चिंता</w:t>
       </w:r>
       <w:r>
         <w:rPr>
           <w:b/>
-          <w:sz w:val="22"/>
-          <w:bCs w:val="1"/>
-          <w:szCs w:val="22"/>
+          <w:bCs/>
+          <w:i w:val="0"/>
+          <w:sz w:val="22"/>
+          <w:szCs w:val="22"/>
+          <w:u w:val="none"/>
         </w:rPr>
         <w:t>-</w:t>
       </w:r>
@@ -1214,9 +1580,11 @@
         <w:rPr>
           <w:rFonts w:cs="Nirmala UI" w:eastAsia="Nirmala UI"/>
           <w:b/>
-          <w:sz w:val="22"/>
-          <w:bCs w:val="1"/>
-          <w:szCs w:val="22"/>
+          <w:bCs/>
+          <w:i w:val="0"/>
+          <w:sz w:val="22"/>
+          <w:szCs w:val="22"/>
+          <w:u w:val="none"/>
         </w:rPr>
         <w:t>पी</w:t>
       </w:r>
@@ -1224,9 +1592,11 @@
         <w:rPr>
           <w:rFonts w:cs="Nirmala UI" w:eastAsia="Nirmala UI"/>
           <w:b/>
-          <w:sz w:val="22"/>
-          <w:bCs w:val="1"/>
-          <w:szCs w:val="22"/>
+          <w:bCs/>
+          <w:i w:val="0"/>
+          <w:sz w:val="22"/>
+          <w:szCs w:val="22"/>
+          <w:u w:val="none"/>
         </w:rPr>
         <w:t>अल्म किसान</w:t>
       </w:r>
@@ -1241,74 +1611,108 @@
           <w:szCs w:val="22"/>
         </w:rPr>
       </w:pPr>
-      <w:r>
-        <w:rPr>
-          <w:sz w:val="22"/>
-          <w:szCs w:val="22"/>
+      <w:proofErr w:type="spellStart"/>
+      <w:proofErr w:type="spellEnd"/>
+      <w:proofErr w:type="spellStart"/>
+      <w:proofErr w:type="spellEnd"/>
+      <w:proofErr w:type="gramStart"/>
+      <w:proofErr w:type="gramEnd"/>
+      <w:r>
+        <w:rPr>
+          <w:b w:val="0"/>
+          <w:i w:val="0"/>
+          <w:sz w:val="22"/>
+          <w:szCs w:val="22"/>
+          <w:u w:val="none"/>
         </w:rPr>
         <w:tab/>
       </w:r>
       <w:r>
         <w:rPr>
           <w:rFonts w:cs="Nirmala UI" w:eastAsia="Nirmala UI"/>
-          <w:sz w:val="22"/>
-          <w:szCs w:val="22"/>
+          <w:b/>
+          <w:bCs/>
+          <w:i w:val="0"/>
+          <w:sz w:val="22"/>
+          <w:szCs w:val="22"/>
+          <w:u w:val="none"/>
         </w:rPr>
         <w:t>डी.आर.के.वी.पी. रामचंद्रा रॉ:</w:t>
       </w:r>
       <w:r>
         <w:rPr>
           <w:rFonts w:cs="Nirmala UI" w:eastAsia="Nirmala UI"/>
-          <w:sz w:val="22"/>
-          <w:szCs w:val="22"/>
+          <w:b w:val="0"/>
+          <w:i w:val="0"/>
+          <w:sz w:val="22"/>
+          <w:szCs w:val="22"/>
+          <w:u w:val="none"/>
         </w:rPr>
         <w:t xml:space="preserve"> राज्यों में तेल-पाम किसानों की दुर्दशा </w:t>
       </w:r>
       <w:r>
         <w:rPr>
           <w:rFonts w:cs="Nirmala UI" w:eastAsia="Nirmala UI"/>
-          <w:sz w:val="22"/>
-          <w:szCs w:val="22"/>
+          <w:b w:val="0"/>
+          <w:i w:val="0"/>
+          <w:sz w:val="22"/>
+          <w:szCs w:val="22"/>
+          <w:u w:val="none"/>
         </w:rPr>
         <w:t>तेलंगाना</w:t>
       </w:r>
       <w:r>
         <w:rPr>
           <w:rFonts w:cs="Nirmala UI" w:eastAsia="Nirmala UI"/>
-          <w:sz w:val="22"/>
-          <w:szCs w:val="22"/>
+          <w:b w:val="0"/>
+          <w:i w:val="0"/>
+          <w:sz w:val="22"/>
+          <w:szCs w:val="22"/>
+          <w:u w:val="none"/>
         </w:rPr>
         <w:t xml:space="preserve"> और आंध्र प्रदेश बहुत दुखी है । पूरे राज्य में तेल उत्पादक. . </w:t>
       </w:r>
       <w:r>
         <w:rPr>
           <w:rFonts w:cs="Nirmala UI" w:eastAsia="Nirmala UI"/>
-          <w:sz w:val="22"/>
-          <w:szCs w:val="22"/>
+          <w:b w:val="0"/>
+          <w:i w:val="0"/>
+          <w:sz w:val="22"/>
+          <w:szCs w:val="22"/>
+          <w:u w:val="none"/>
         </w:rPr>
         <w:t>तेलंगाना</w:t>
       </w:r>
       <w:r>
         <w:rPr>
           <w:rFonts w:cs="Nirmala UI" w:eastAsia="Nirmala UI"/>
-          <w:sz w:val="22"/>
-          <w:szCs w:val="22"/>
+          <w:b w:val="0"/>
+          <w:i w:val="0"/>
+          <w:sz w:val="22"/>
+          <w:szCs w:val="22"/>
+          <w:u w:val="none"/>
         </w:rPr>
         <w:t xml:space="preserve"> और आंध्र प्रदेश पाम तेल की खेती करने की स्थिति में नहीं है । इसलिए उन्होंने ताड़ के तेल के पेड़ों को काटना शुरू कर दिया है और इससे हमारे देश में तेल के उत्पादन पर असर पड़ेगा. </w:t>
       </w:r>
       <w:r>
         <w:rPr>
           <w:rFonts w:cs="Nirmala UI" w:eastAsia="Nirmala UI"/>
-          <w:sz w:val="22"/>
-          <w:szCs w:val="22"/>
+          <w:b w:val="0"/>
+          <w:i w:val="0"/>
+          <w:sz w:val="22"/>
+          <w:szCs w:val="22"/>
+          <w:u w:val="none"/>
         </w:rPr>
         <w:t>अगर पेड़ों को काटा जाता है तो इसमें कम से कम पांच साल लगेंगे , जो किसानों को कठिन समय देगा.</w:t>
       </w:r>
       <w:r>
         <w:rPr>
           <w:rFonts w:cs="Nirmala UI" w:eastAsia="Nirmala UI"/>
-          <w:sz w:val="22"/>
-          <w:szCs w:val="22"/>
+          <w:b w:val="0"/>
+          <w:i w:val="0"/>
+          <w:sz w:val="22"/>
+          <w:szCs w:val="22"/>
+          <w:u w:val="none"/>
         </w:rPr>
         <w:t xml:space="preserve"> इसलिए सरकार को सब्सिडी देने के लिए आगे आना चाहिए.</w:t>
       </w:r>
@@ -1323,48 +1727,75 @@
           <w:szCs w:val="22"/>
         </w:rPr>
       </w:pPr>
-      <w:r>
-        <w:rPr>
-          <w:sz w:val="22"/>
-          <w:szCs w:val="22"/>
+      <w:proofErr w:type="spellStart"/>
+      <w:proofErr w:type="spellEnd"/>
+      <w:proofErr w:type="spellStart"/>
+      <w:proofErr w:type="spellEnd"/>
+      <w:r>
+        <w:rPr>
+          <w:b w:val="0"/>
+          <w:i w:val="0"/>
+          <w:sz w:val="22"/>
+          <w:szCs w:val="22"/>
+          <w:u w:val="none"/>
         </w:rPr>
         <w:tab/>
       </w:r>
       <w:r>
         <w:rPr>
-          <w:sz w:val="22"/>
-          <w:szCs w:val="22"/>
+          <w:b w:val="0"/>
+          <w:i/>
+          <w:iCs/>
+          <w:sz w:val="22"/>
+          <w:szCs w:val="22"/>
+          <w:u w:val="none"/>
         </w:rPr>
         <w:t>(</w:t>
       </w:r>
       <w:r>
         <w:rPr>
           <w:rFonts w:cs="Nirmala UI" w:eastAsia="Nirmala UI"/>
-          <w:sz w:val="22"/>
-          <w:szCs w:val="22"/>
+          <w:b w:val="0"/>
+          <w:i/>
+          <w:iCs/>
+          <w:sz w:val="22"/>
+          <w:szCs w:val="22"/>
+          <w:u w:val="none"/>
         </w:rPr>
         <w:t>श्री</w:t>
       </w:r>
       <w:r>
         <w:rPr>
-          <w:sz w:val="22"/>
-          <w:szCs w:val="22"/>
+          <w:b w:val="0"/>
+          <w:i/>
+          <w:iCs/>
+          <w:sz w:val="22"/>
+          <w:szCs w:val="22"/>
+          <w:u w:val="none"/>
         </w:rPr>
         <w:t xml:space="preserve"> </w:t>
       </w:r>
       <w:r>
         <w:rPr>
           <w:rFonts w:cs="Nirmala UI" w:eastAsia="Nirmala UI"/>
-          <w:sz w:val="22"/>
-          <w:szCs w:val="22"/>
+          <w:b w:val="0"/>
+          <w:i/>
+          <w:iCs/>
+          <w:sz w:val="22"/>
+          <w:szCs w:val="22"/>
+          <w:u w:val="none"/>
         </w:rPr>
         <w:t>मोहम्मद</w:t>
       </w:r>
       <w:r>
         <w:rPr>
           <w:rFonts w:cs="Nirmala UI" w:eastAsia="Nirmala UI"/>
-          <w:sz w:val="22"/>
-          <w:szCs w:val="22"/>
+          <w:b w:val="0"/>
+          <w:i/>
+          <w:iCs/>
+          <w:sz w:val="22"/>
+          <w:szCs w:val="22"/>
+          <w:u w:val="none"/>
         </w:rPr>
         <w:t>. अली खान जुड़े हुए हैं.)</w:t>
       </w:r>
@@ -1379,21 +1810,32 @@
           <w:szCs w:val="22"/>
         </w:rPr>
       </w:pPr>
-      <w:r>
-        <w:rPr>
-          <w:b/>
-          <w:sz w:val="22"/>
-          <w:bCs w:val="1"/>
-          <w:szCs w:val="22"/>
+      <w:proofErr w:type="spellStart"/>
+      <w:proofErr w:type="spellEnd"/>
+      <w:proofErr w:type="spellStart"/>
+      <w:proofErr w:type="spellEnd"/>
+      <w:proofErr w:type="spellStart"/>
+      <w:proofErr w:type="spellEnd"/>
+      <w:proofErr w:type="spellStart"/>
+      <w:proofErr w:type="spellEnd"/>
+      <w:r>
+        <w:rPr>
+          <w:b/>
+          <w:bCs/>
+          <w:i w:val="0"/>
+          <w:sz w:val="22"/>
+          <w:szCs w:val="22"/>
+          <w:u w:val="none"/>
         </w:rPr>
         <w:t>5.</w:t>
       </w:r>
       <w:r>
         <w:rPr>
-          <w:b/>
-          <w:sz w:val="22"/>
-          <w:bCs w:val="1"/>
-          <w:szCs w:val="22"/>
+          <w:b w:val="0"/>
+          <w:i w:val="0"/>
+          <w:sz w:val="22"/>
+          <w:szCs w:val="22"/>
+          <w:u w:val="none"/>
         </w:rPr>
         <w:t xml:space="preserve"> </w:t>
       </w:r>
@@ -1401,9 +1843,11 @@
         <w:rPr>
           <w:rFonts w:cs="Nirmala UI" w:eastAsia="Nirmala UI"/>
           <w:b/>
-          <w:sz w:val="22"/>
-          <w:bCs w:val="1"/>
-          <w:szCs w:val="22"/>
+          <w:bCs/>
+          <w:i w:val="0"/>
+          <w:sz w:val="22"/>
+          <w:szCs w:val="22"/>
+          <w:u w:val="none"/>
         </w:rPr>
         <w:t xml:space="preserve">ग्रामीणों के विरोध का आरोप. </w:t>
       </w:r>
@@ -1411,9 +1855,11 @@
         <w:rPr>
           <w:rFonts w:cs="Nirmala UI" w:eastAsia="Nirmala UI"/>
           <w:b/>
-          <w:sz w:val="22"/>
-          <w:bCs w:val="1"/>
-          <w:szCs w:val="22"/>
+          <w:bCs/>
+          <w:i w:val="0"/>
+          <w:sz w:val="22"/>
+          <w:szCs w:val="22"/>
+          <w:u w:val="none"/>
         </w:rPr>
         <w:t>नाकेरी</w:t>
       </w:r>
@@ -1421,9 +1867,11 @@
         <w:rPr>
           <w:rFonts w:cs="Nirmala UI" w:eastAsia="Nirmala UI"/>
           <w:b/>
-          <w:sz w:val="22"/>
-          <w:bCs w:val="1"/>
-          <w:szCs w:val="22"/>
+          <w:bCs/>
+          <w:i w:val="0"/>
+          <w:sz w:val="22"/>
+          <w:szCs w:val="22"/>
+          <w:u w:val="none"/>
         </w:rPr>
         <w:t xml:space="preserve"> और </w:t>
       </w:r>
@@ -1431,9 +1879,11 @@
         <w:rPr>
           <w:rFonts w:cs="Nirmala UI" w:eastAsia="Nirmala UI"/>
           <w:b/>
-          <w:sz w:val="22"/>
-          <w:bCs w:val="1"/>
-          <w:szCs w:val="22"/>
+          <w:bCs/>
+          <w:i w:val="0"/>
+          <w:sz w:val="22"/>
+          <w:szCs w:val="22"/>
+          <w:u w:val="none"/>
         </w:rPr>
         <w:t>बैतूल.</w:t>
       </w:r>
@@ -1441,9 +1891,11 @@
         <w:rPr>
           <w:rFonts w:cs="Nirmala UI" w:eastAsia="Nirmala UI"/>
           <w:b/>
-          <w:sz w:val="22"/>
-          <w:bCs w:val="1"/>
-          <w:szCs w:val="22"/>
+          <w:bCs/>
+          <w:i w:val="0"/>
+          <w:sz w:val="22"/>
+          <w:szCs w:val="22"/>
+          <w:u w:val="none"/>
         </w:rPr>
         <w:t xml:space="preserve"> में </w:t>
       </w:r>
@@ -1451,18 +1903,22 @@
         <w:rPr>
           <w:rFonts w:cs="Nirmala UI" w:eastAsia="Nirmala UI"/>
           <w:b/>
-          <w:sz w:val="22"/>
-          <w:bCs w:val="1"/>
-          <w:szCs w:val="22"/>
+          <w:bCs/>
+          <w:i w:val="0"/>
+          <w:sz w:val="22"/>
+          <w:szCs w:val="22"/>
+          <w:u w:val="none"/>
         </w:rPr>
         <w:t>क्यूपेम</w:t>
       </w:r>
       <w:r>
         <w:rPr>
           <w:b/>
-          <w:sz w:val="22"/>
-          <w:bCs w:val="1"/>
-          <w:szCs w:val="22"/>
+          <w:bCs/>
+          <w:i w:val="0"/>
+          <w:sz w:val="22"/>
+          <w:szCs w:val="22"/>
+          <w:u w:val="none"/>
         </w:rPr>
         <w:t xml:space="preserve"> </w:t>
       </w:r>
@@ -1470,9 +1926,11 @@
         <w:rPr>
           <w:rFonts w:cs="Nirmala UI" w:eastAsia="Nirmala UI"/>
           <w:b/>
-          <w:sz w:val="22"/>
-          <w:bCs w:val="1"/>
-          <w:szCs w:val="22"/>
+          <w:bCs/>
+          <w:i w:val="0"/>
+          <w:sz w:val="22"/>
+          <w:szCs w:val="22"/>
+          <w:u w:val="none"/>
         </w:rPr>
         <w:t>तालुका.</w:t>
       </w:r>
@@ -1480,9 +1938,11 @@
         <w:rPr>
           <w:rFonts w:cs="Nirmala UI" w:eastAsia="Nirmala UI"/>
           <w:b/>
-          <w:sz w:val="22"/>
-          <w:bCs w:val="1"/>
-          <w:szCs w:val="22"/>
+          <w:bCs/>
+          <w:i w:val="0"/>
+          <w:sz w:val="22"/>
+          <w:szCs w:val="22"/>
+          <w:u w:val="none"/>
         </w:rPr>
         <w:t xml:space="preserve"> प्रस्तावित रक्षा प्रदर्शनी के लिए दक्षिण गोवा</w:t>
       </w:r>
@@ -1497,113 +1957,166 @@
           <w:szCs w:val="22"/>
         </w:rPr>
       </w:pPr>
-      <w:r>
-        <w:rPr>
-          <w:sz w:val="22"/>
-          <w:szCs w:val="22"/>
+      <w:proofErr w:type="spellStart"/>
+      <w:proofErr w:type="spellEnd"/>
+      <w:proofErr w:type="spellStart"/>
+      <w:proofErr w:type="spellEnd"/>
+      <w:proofErr w:type="spellStart"/>
+      <w:proofErr w:type="spellEnd"/>
+      <w:proofErr w:type="spellStart"/>
+      <w:proofErr w:type="spellEnd"/>
+      <w:proofErr w:type="gramStart"/>
+      <w:proofErr w:type="gramEnd"/>
+      <w:r>
+        <w:rPr>
+          <w:b w:val="0"/>
+          <w:i w:val="0"/>
+          <w:sz w:val="22"/>
+          <w:szCs w:val="22"/>
+          <w:u w:val="none"/>
         </w:rPr>
         <w:tab/>
       </w:r>
       <w:r>
         <w:rPr>
           <w:rFonts w:cs="Nirmala UI" w:eastAsia="Nirmala UI"/>
-          <w:sz w:val="22"/>
-          <w:szCs w:val="22"/>
+          <w:b/>
+          <w:bCs/>
+          <w:i w:val="0"/>
+          <w:sz w:val="22"/>
+          <w:szCs w:val="22"/>
+          <w:u w:val="none"/>
         </w:rPr>
         <w:t>श्री शंताराम नाईक:</w:t>
       </w:r>
       <w:r>
         <w:rPr>
           <w:rFonts w:cs="Nirmala UI" w:eastAsia="Nirmala UI"/>
-          <w:sz w:val="22"/>
-          <w:szCs w:val="22"/>
+          <w:b w:val="0"/>
+          <w:i w:val="0"/>
+          <w:sz w:val="22"/>
+          <w:szCs w:val="22"/>
+          <w:u w:val="none"/>
         </w:rPr>
         <w:t xml:space="preserve"> गांव और आसपास के गांवों. . </w:t>
       </w:r>
       <w:r>
         <w:rPr>
           <w:rFonts w:cs="Nirmala UI" w:eastAsia="Nirmala UI"/>
-          <w:sz w:val="22"/>
-          <w:szCs w:val="22"/>
+          <w:b w:val="0"/>
+          <w:i w:val="0"/>
+          <w:sz w:val="22"/>
+          <w:szCs w:val="22"/>
+          <w:u w:val="none"/>
         </w:rPr>
         <w:t>नाकेरी</w:t>
       </w:r>
       <w:r>
         <w:rPr>
           <w:rFonts w:cs="Nirmala UI" w:eastAsia="Nirmala UI"/>
-          <w:sz w:val="22"/>
-          <w:szCs w:val="22"/>
+          <w:b w:val="0"/>
+          <w:i w:val="0"/>
+          <w:sz w:val="22"/>
+          <w:szCs w:val="22"/>
+          <w:u w:val="none"/>
         </w:rPr>
         <w:t xml:space="preserve"> और </w:t>
       </w:r>
       <w:r>
         <w:rPr>
           <w:rFonts w:cs="Nirmala UI" w:eastAsia="Nirmala UI"/>
-          <w:sz w:val="22"/>
-          <w:szCs w:val="22"/>
+          <w:b w:val="0"/>
+          <w:i w:val="0"/>
+          <w:sz w:val="22"/>
+          <w:szCs w:val="22"/>
+          <w:u w:val="none"/>
         </w:rPr>
         <w:t>बैतूल.</w:t>
       </w:r>
       <w:r>
         <w:rPr>
           <w:rFonts w:cs="Nirmala UI" w:eastAsia="Nirmala UI"/>
-          <w:sz w:val="22"/>
-          <w:szCs w:val="22"/>
+          <w:b w:val="0"/>
+          <w:i w:val="0"/>
+          <w:sz w:val="22"/>
+          <w:szCs w:val="22"/>
+          <w:u w:val="none"/>
         </w:rPr>
         <w:t xml:space="preserve"> में </w:t>
       </w:r>
       <w:r>
         <w:rPr>
           <w:rFonts w:cs="Nirmala UI" w:eastAsia="Nirmala UI"/>
-          <w:sz w:val="22"/>
-          <w:szCs w:val="22"/>
+          <w:b w:val="0"/>
+          <w:i w:val="0"/>
+          <w:sz w:val="22"/>
+          <w:szCs w:val="22"/>
+          <w:u w:val="none"/>
         </w:rPr>
         <w:t>क्यूपेम</w:t>
       </w:r>
       <w:r>
         <w:rPr>
-          <w:sz w:val="22"/>
-          <w:szCs w:val="22"/>
+          <w:b w:val="0"/>
+          <w:i w:val="0"/>
+          <w:sz w:val="22"/>
+          <w:szCs w:val="22"/>
+          <w:u w:val="none"/>
         </w:rPr>
         <w:t xml:space="preserve"> </w:t>
       </w:r>
       <w:r>
         <w:rPr>
           <w:rFonts w:cs="Nirmala UI" w:eastAsia="Nirmala UI"/>
-          <w:sz w:val="22"/>
-          <w:szCs w:val="22"/>
+          <w:b w:val="0"/>
+          <w:i w:val="0"/>
+          <w:sz w:val="22"/>
+          <w:szCs w:val="22"/>
+          <w:u w:val="none"/>
         </w:rPr>
         <w:t>तालुका.</w:t>
       </w:r>
       <w:r>
         <w:rPr>
           <w:rFonts w:cs="Nirmala UI" w:eastAsia="Nirmala UI"/>
-          <w:sz w:val="22"/>
-          <w:szCs w:val="22"/>
+          <w:b w:val="0"/>
+          <w:i w:val="0"/>
+          <w:sz w:val="22"/>
+          <w:szCs w:val="22"/>
+          <w:u w:val="none"/>
         </w:rPr>
         <w:t xml:space="preserve"> दक्षिण गोवा जिला इस इलाके में रक्षा प्रदर्शनी आयोजित करने के रक्षा मंत्रालय के प्रस्ताव को लेकर अत्यधिक उत्तेजित है । राज्य सरकार ने </w:t>
       </w:r>
       <w:r>
         <w:rPr>
           <w:rFonts w:cs="Nirmala UI" w:eastAsia="Nirmala UI"/>
-          <w:sz w:val="22"/>
-          <w:szCs w:val="22"/>
+          <w:b w:val="0"/>
+          <w:i w:val="0"/>
+          <w:sz w:val="22"/>
+          <w:szCs w:val="22"/>
+          <w:u w:val="none"/>
         </w:rPr>
         <w:t xml:space="preserve">इस तथ्य के बावजूद अनुमति दी गई कि भूमि गोवा औद्योगिक विकास निगम की एक भूमि है । यह अजीब है कि गोवा </w:t>
       </w:r>
       <w:r>
         <w:rPr>
           <w:rFonts w:cs="Nirmala UI" w:eastAsia="Nirmala UI"/>
-          <w:sz w:val="22"/>
-          <w:szCs w:val="22"/>
+          <w:b w:val="0"/>
+          <w:i w:val="0"/>
+          <w:sz w:val="22"/>
+          <w:szCs w:val="22"/>
+          <w:u w:val="none"/>
         </w:rPr>
         <w:t>सरकार,</w:t>
       </w:r>
       <w:r>
         <w:rPr>
           <w:rFonts w:cs="Nirmala UI" w:eastAsia="Nirmala UI"/>
-          <w:sz w:val="22"/>
-          <w:szCs w:val="22"/>
+          <w:b w:val="0"/>
+          <w:i w:val="0"/>
+          <w:sz w:val="22"/>
+          <w:szCs w:val="22"/>
+          <w:u w:val="none"/>
         </w:rPr>
         <w:t xml:space="preserve"> जाहिर तौर पर रक्षा प्रदर्शनी को जमीन आवंटित करने के लिए केंद्र सरकार के दबाव का सामना करना पड़ा है। पिछले छह महीनों में इसके खिलाफ कई आंदोलन हुए हैं.</w:t>
       </w:r>
@@ -1675,10 +2188,12 @@
         <w:rPr>
           <w:rFonts w:cs="Nirmala UI" w:eastAsia="Nirmala UI"/>
           <w:b/>
+          <w:bCs/>
+          <w:i w:val="0"/>
           <w:color w:val="000000"/>
           <w:sz w:val="22"/>
-          <w:bCs w:val="1"/>
-          <w:szCs w:val="22"/>
+          <w:szCs w:val="22"/>
+          <w:u w:val="none"/>
         </w:rPr>
         <w:t>शमशेर के. शेरफ,</w:t>
       </w:r>
@@ -1698,14 +2213,18 @@
           <w:szCs w:val="22"/>
         </w:rPr>
       </w:pPr>
-      <w:r>
-        <w:rPr>
-          <w:rFonts w:cs="Nirmala UI" w:eastAsia="Nirmala UI"/>
+      <w:proofErr w:type="gramStart"/>
+      <w:proofErr w:type="gramEnd"/>
+      <w:r>
+        <w:rPr>
+          <w:rFonts w:cs="Nirmala UI" w:eastAsia="Nirmala UI"/>
+          <w:b w:val="0"/>
           <w:i/>
+          <w:iCs/>
           <w:color w:val="000000"/>
           <w:sz w:val="22"/>
-          <w:iCs w:val="1"/>
-          <w:szCs w:val="22"/>
+          <w:szCs w:val="22"/>
+          <w:u w:val="none"/>
         </w:rPr>
         <w:t>महासचिव.</w:t>
       </w:r>
@@ -1743,6 +2262,19 @@
           <w:u w:val="single"/>
         </w:rPr>
       </w:pPr>
+      <w:hyperlink r:id="rId8" w:history="1">
+        <w:r>
+          <w:rPr>
+            <w:rStyle w:val="Hyperlink"/>
+            <w:rFonts w:cs="Times New Roman"/>
+            <w:b/>
+            <w:bCs/>
+            <w:sz w:val="22"/>
+            <w:szCs w:val="22"/>
+          </w:rPr>
+          <w:t>rssynop@sansad.nic.in</w:t>
+        </w:r>
+      </w:hyperlink>
       <w:r>
         <w:t>rssynop@sansad.nic.in</w:t>
       </w:r>
@@ -1763,6 +2295,10 @@
     <w:sectPr>
       <w:footerReference w:type="even" r:id="rId9"/>
       <w:footerReference w:type="default" r:id="rId10"/>
+      <w:headerReference w:type="default" r:id="rId13"/>
+      <w:headerReference w:type="first" r:id="rId14"/>
+      <w:headerReference w:type="even" r:id="rId15"/>
+      <w:footerReference w:type="first" r:id="rId16"/>
       <w:pgSz w:w="9115" w:h="11995" w:code="1"/>
       <w:pgMar w:top="1440" w:right="1440" w:bottom="1079" w:left="1440" w:header="720" w:footer="720" w:gutter="0"/>
       <w:pgNumType w:start="44"/>
@@ -1899,6 +2435,16 @@
 </w:ftr>
 </file>
 
+<file path=word/footer3.xml><?xml version="1.0" encoding="utf-8"?>
+<w:ftr xmlns:m="http://schemas.openxmlformats.org/officeDocument/2006/math" xmlns:mc="http://schemas.openxmlformats.org/markup-compatibility/2006" xmlns:mo="http://schemas.microsoft.com/office/mac/office/2008/main" xmlns:mv="urn:schemas-microsoft-com:mac:vml" xmlns:o="urn:schemas-microsoft-com:office:office" xmlns:r="http://schemas.openxmlformats.org/officeDocument/2006/relationships" xmlns:v="urn:schemas-microsoft-com:vml" xmlns:w10="urn:schemas-microsoft-com:office:word" xmlns:w14="http://schemas.microsoft.com/office/word/2010/wordml" xmlns:w="http://schemas.openxmlformats.org/wordprocessingml/2006/main" xmlns:wne="http://schemas.microsoft.com/office/word/2006/wordml" xmlns:wp14="http://schemas.microsoft.com/office/word/2010/wordprocessingDrawing" xmlns:wp="http://schemas.openxmlformats.org/drawingml/2006/wordprocessingDrawing" xmlns:wpc="http://schemas.microsoft.com/office/word/2010/wordprocessingCanvas" xmlns:wpg="http://schemas.microsoft.com/office/word/2010/wordprocessingGroup" xmlns:wpi="http://schemas.microsoft.com/office/word/2010/wordprocessingInk" xmlns:wps="http://schemas.microsoft.com/office/word/2010/wordprocessingShape" mc:Ignorable="w14 wp14">
+  <w:p>
+    <w:pPr>
+      <w:pStyle w:val="Footer"/>
+    </w:pPr>
+  </w:p>
+</w:ftr>
+</file>
+
 <file path=word/footnotes.xml><?xml version="1.0" encoding="utf-8"?>
 <w:footnotes xmlns:ve="http://schemas.openxmlformats.org/markup-compatibility/2006" xmlns:o="urn:schemas-microsoft-com:office:office" xmlns:r="http://schemas.openxmlformats.org/officeDocument/2006/relationships" xmlns:m="http://schemas.openxmlformats.org/officeDocument/2006/math" xmlns:v="urn:schemas-microsoft-com:vml" xmlns:wp="http://schemas.openxmlformats.org/drawingml/2006/wordprocessingDrawing" xmlns:w10="urn:schemas-microsoft-com:office:word" xmlns:w="http://schemas.openxmlformats.org/wordprocessingml/2006/main" xmlns:wne="http://schemas.microsoft.com/office/word/2006/wordml">
   <w:footnote w:type="separator" w:id="-1">
@@ -1951,6 +2497,36 @@
     </w:p>
   </w:footnote>
 </w:footnotes>
+</file>
+
+<file path=word/header1.xml><?xml version="1.0" encoding="utf-8"?>
+<w:hdr xmlns:m="http://schemas.openxmlformats.org/officeDocument/2006/math" xmlns:mc="http://schemas.openxmlformats.org/markup-compatibility/2006" xmlns:mo="http://schemas.microsoft.com/office/mac/office/2008/main" xmlns:mv="urn:schemas-microsoft-com:mac:vml" xmlns:o="urn:schemas-microsoft-com:office:office" xmlns:r="http://schemas.openxmlformats.org/officeDocument/2006/relationships" xmlns:v="urn:schemas-microsoft-com:vml" xmlns:w10="urn:schemas-microsoft-com:office:word" xmlns:w14="http://schemas.microsoft.com/office/word/2010/wordml" xmlns:w="http://schemas.openxmlformats.org/wordprocessingml/2006/main" xmlns:wne="http://schemas.microsoft.com/office/word/2006/wordml" xmlns:wp14="http://schemas.microsoft.com/office/word/2010/wordprocessingDrawing" xmlns:wp="http://schemas.openxmlformats.org/drawingml/2006/wordprocessingDrawing" xmlns:wpc="http://schemas.microsoft.com/office/word/2010/wordprocessingCanvas" xmlns:wpg="http://schemas.microsoft.com/office/word/2010/wordprocessingGroup" xmlns:wpi="http://schemas.microsoft.com/office/word/2010/wordprocessingInk" xmlns:wps="http://schemas.microsoft.com/office/word/2010/wordprocessingShape" mc:Ignorable="w14 wp14">
+  <w:p>
+    <w:pPr>
+      <w:pStyle w:val="Header"/>
+    </w:pPr>
+  </w:p>
+</w:hdr>
+</file>
+
+<file path=word/header2.xml><?xml version="1.0" encoding="utf-8"?>
+<w:hdr xmlns:m="http://schemas.openxmlformats.org/officeDocument/2006/math" xmlns:mc="http://schemas.openxmlformats.org/markup-compatibility/2006" xmlns:mo="http://schemas.microsoft.com/office/mac/office/2008/main" xmlns:mv="urn:schemas-microsoft-com:mac:vml" xmlns:o="urn:schemas-microsoft-com:office:office" xmlns:r="http://schemas.openxmlformats.org/officeDocument/2006/relationships" xmlns:v="urn:schemas-microsoft-com:vml" xmlns:w10="urn:schemas-microsoft-com:office:word" xmlns:w14="http://schemas.microsoft.com/office/word/2010/wordml" xmlns:w="http://schemas.openxmlformats.org/wordprocessingml/2006/main" xmlns:wne="http://schemas.microsoft.com/office/word/2006/wordml" xmlns:wp14="http://schemas.microsoft.com/office/word/2010/wordprocessingDrawing" xmlns:wp="http://schemas.openxmlformats.org/drawingml/2006/wordprocessingDrawing" xmlns:wpc="http://schemas.microsoft.com/office/word/2010/wordprocessingCanvas" xmlns:wpg="http://schemas.microsoft.com/office/word/2010/wordprocessingGroup" xmlns:wpi="http://schemas.microsoft.com/office/word/2010/wordprocessingInk" xmlns:wps="http://schemas.microsoft.com/office/word/2010/wordprocessingShape" mc:Ignorable="w14 wp14">
+  <w:p>
+    <w:pPr>
+      <w:pStyle w:val="Header"/>
+    </w:pPr>
+  </w:p>
+</w:hdr>
+</file>
+
+<file path=word/header3.xml><?xml version="1.0" encoding="utf-8"?>
+<w:hdr xmlns:m="http://schemas.openxmlformats.org/officeDocument/2006/math" xmlns:mc="http://schemas.openxmlformats.org/markup-compatibility/2006" xmlns:mo="http://schemas.microsoft.com/office/mac/office/2008/main" xmlns:mv="urn:schemas-microsoft-com:mac:vml" xmlns:o="urn:schemas-microsoft-com:office:office" xmlns:r="http://schemas.openxmlformats.org/officeDocument/2006/relationships" xmlns:v="urn:schemas-microsoft-com:vml" xmlns:w10="urn:schemas-microsoft-com:office:word" xmlns:w14="http://schemas.microsoft.com/office/word/2010/wordml" xmlns:w="http://schemas.openxmlformats.org/wordprocessingml/2006/main" xmlns:wne="http://schemas.microsoft.com/office/word/2006/wordml" xmlns:wp14="http://schemas.microsoft.com/office/word/2010/wordprocessingDrawing" xmlns:wp="http://schemas.openxmlformats.org/drawingml/2006/wordprocessingDrawing" xmlns:wpc="http://schemas.microsoft.com/office/word/2010/wordprocessingCanvas" xmlns:wpg="http://schemas.microsoft.com/office/word/2010/wordprocessingGroup" xmlns:wpi="http://schemas.microsoft.com/office/word/2010/wordprocessingInk" xmlns:wps="http://schemas.microsoft.com/office/word/2010/wordprocessingShape" mc:Ignorable="w14 wp14">
+  <w:p>
+    <w:pPr>
+      <w:pStyle w:val="Header"/>
+    </w:pPr>
+  </w:p>
+</w:hdr>
 </file>
 
 <file path=word/numbering.xml><?xml version="1.0" encoding="utf-8"?>

</xml_diff>